<commit_message>
Добавил learning curve plot / training loss plot
</commit_message>
<xml_diff>
--- a/logo_detection_report.docx
+++ b/logo_detection_report.docx
@@ -171,6 +171,19 @@
       </w:pPr>
       <w:r>
         <w:t xml:space="preserve">Выявлено и задокументировано слабое место: логотипы с минималистичной геометрией (nike) детектируются с заметно более низким recall (0.45)</w:t>
+      </w:r>
+    </w:p>
+    <w:p>
+      <w:pPr>
+        <w:pStyle w:val="ListParagraph"/>
+        <w:numPr>
+          <w:ilvl w:val="0"/>
+          <w:numId w:val="1"/>
+        </w:numPr>
+        <w:spacing w:after="80"/>
+      </w:pPr>
+      <w:r>
+        <w:t xml:space="preserve">Анализ кривых обучения и матрицы ошибок подтверждает отсутствие переобучения и пренебрежимо малую кросс-брендовую путаницу</w:t>
       </w:r>
     </w:p>
     <w:p>
@@ -5364,6 +5377,271 @@
       </w:pPr>
       <w:r>
         <w:t xml:space="preserve">Детекции со score &lt; 0.25 отбрасываются на уровне модели (MIN_DETECTION_CONF)</w:t>
+      </w:r>
+    </w:p>
+    <w:p>
+      <w:pPr>
+        <w:pStyle w:val="Heading2"/>
+        <w:spacing w:after="120" w:before="280"/>
+      </w:pPr>
+      <w:r>
+        <w:t xml:space="preserve">6.5. Кривые обучения</w:t>
+      </w:r>
+    </w:p>
+    <w:p>
+      <w:pPr>
+        <w:spacing w:after="160" w:line="300"/>
+      </w:pPr>
+      <w:r>
+        <w:t xml:space="preserve">Ниже — динамика функций потерь (box/cls/dfl loss, train и val) и метрик (precision, recall, mAP50, mAP50-95) по всем 60 эпохам обучения.</w:t>
+      </w:r>
+    </w:p>
+    <w:p>
+      <w:pPr>
+        <w:spacing w:after="60" w:before="120"/>
+        <w:jc w:val="center"/>
+      </w:pPr>
+      <w:r>
+        <w:drawing>
+          <wp:inline distT="0" distB="0" distL="0" distR="0">
+            <wp:extent cx="5905500" cy="2952750"/>
+            <wp:effectExtent t="0" r="0" b="0" l="0"/>
+            <wp:docPr id="1" name="" descr="" title=""/>
+            <wp:cNvGraphicFramePr>
+              <a:graphicFrameLocks xmlns:a="http://schemas.openxmlformats.org/drawingml/2006/main" noChangeAspect="1"/>
+            </wp:cNvGraphicFramePr>
+            <a:graphic xmlns:a="http://schemas.openxmlformats.org/drawingml/2006/main">
+              <a:graphicData uri="http://schemas.openxmlformats.org/drawingml/2006/picture">
+                <pic:pic xmlns:pic="http://schemas.openxmlformats.org/drawingml/2006/picture">
+                  <pic:nvPicPr>
+                    <pic:cNvPr id="0" name="" descr=""/>
+                    <pic:cNvPicPr>
+                      <a:picLocks noChangeAspect="1" noChangeArrowheads="1"/>
+                    </pic:cNvPicPr>
+                  </pic:nvPicPr>
+                  <pic:blipFill>
+                    <a:blip r:embed="rId9" cstate="none"/>
+                    <a:srcRect/>
+                    <a:stretch>
+                      <a:fillRect/>
+                    </a:stretch>
+                  </pic:blipFill>
+                  <pic:spPr bwMode="auto">
+                    <a:xfrm>
+                      <a:off x="0" y="0"/>
+                      <a:ext cx="5905500" cy="2952750"/>
+                    </a:xfrm>
+                    <a:prstGeom prst="rect">
+                      <a:avLst/>
+                    </a:prstGeom>
+                  </pic:spPr>
+                </pic:pic>
+              </a:graphicData>
+            </a:graphic>
+          </wp:inline>
+        </w:drawing>
+      </w:r>
+    </w:p>
+    <w:p>
+      <w:pPr>
+        <w:spacing w:after="200"/>
+        <w:jc w:val="center"/>
+      </w:pPr>
+      <w:r>
+        <w:rPr>
+          <w:i/>
+          <w:iCs/>
+          <w:color w:val="595959"/>
+          <w:sz w:val="18"/>
+          <w:szCs w:val="18"/>
+        </w:rPr>
+        <w:t xml:space="preserve">Рис. 1. Loss и метрики по эпохам (train — верхний ряд, val — нижний ряд)</w:t>
+      </w:r>
+    </w:p>
+    <w:p>
+      <w:pPr>
+        <w:spacing w:after="160" w:line="300"/>
+      </w:pPr>
+      <w:r>
+        <w:t xml:space="preserve">Наблюдения:</w:t>
+      </w:r>
+    </w:p>
+    <w:p>
+      <w:pPr>
+        <w:pStyle w:val="ListParagraph"/>
+        <w:numPr>
+          <w:ilvl w:val="0"/>
+          <w:numId w:val="1"/>
+        </w:numPr>
+        <w:spacing w:after="80"/>
+      </w:pPr>
+      <w:r>
+        <w:t xml:space="preserve">Все три компонента train loss (box, cls, dfl) монотонно снижаются на протяжении всего обучения без признаков расхождения. Заметный скачок вниз около 50-й эпохи — ожидаемый эффект отключения mosaic-аугментации на последних 10 эпохах (штатное поведение Ultralytics, close_mosaic=10), после которого модель дообучается на немодифицированных изображениях.</w:t>
+      </w:r>
+    </w:p>
+    <w:p>
+      <w:pPr>
+        <w:pStyle w:val="ListParagraph"/>
+        <w:numPr>
+          <w:ilvl w:val="0"/>
+          <w:numId w:val="1"/>
+        </w:numPr>
+        <w:spacing w:after="80"/>
+      </w:pPr>
+      <w:r>
+        <w:t xml:space="preserve">Val loss снижается тем же трендом, что и train loss, без роста к концу обучения — явных признаков переобучения не выявлено.</w:t>
+      </w:r>
+    </w:p>
+    <w:p>
+      <w:pPr>
+        <w:pStyle w:val="ListParagraph"/>
+        <w:numPr>
+          <w:ilvl w:val="0"/>
+          <w:numId w:val="1"/>
+        </w:numPr>
+        <w:spacing w:after="80"/>
+      </w:pPr>
+      <w:r>
+        <w:t xml:space="preserve">Precision выходит на плато (~0.88-0.89) уже к 20-й эпохе; recall и mAP50 продолжают медленно расти до 45-50-й эпохи, после чего стабилизируются — это объясняет, почему early stopping (patience=15) не сработал: метрики хоть и медленно, но продолжали улучшаться на всём протяжении обучения.</w:t>
+      </w:r>
+    </w:p>
+    <w:p>
+      <w:pPr>
+        <w:pStyle w:val="Heading2"/>
+        <w:spacing w:after="120" w:before="280"/>
+      </w:pPr>
+      <w:r>
+        <w:t xml:space="preserve">6.6. Матрица ошибок</w:t>
+      </w:r>
+    </w:p>
+    <w:p>
+      <w:pPr>
+        <w:spacing w:after="160" w:line="300"/>
+      </w:pPr>
+      <w:r>
+        <w:t xml:space="preserve">Матрица ошибок построена на валидационной выборке (val, 1075 изображений) в рамках стандартного цикла валидации Ultralytics по завершении обучения — в отличие от таблицы в разделе 6.2, посчитанной отдельным прогоном evaluate.py на отложенной test-выборке. Числа между разделами 6.2 и 6.6 поэтому не идентичны, но согласуются по общей картине.</w:t>
+      </w:r>
+    </w:p>
+    <w:p>
+      <w:pPr>
+        <w:spacing w:after="60" w:before="120"/>
+        <w:jc w:val="center"/>
+      </w:pPr>
+      <w:r>
+        <w:drawing>
+          <wp:inline distT="0" distB="0" distL="0" distR="0">
+            <wp:extent cx="4953000" cy="3714750"/>
+            <wp:effectExtent t="0" r="0" b="0" l="0"/>
+            <wp:docPr id="1" name="" descr="" title=""/>
+            <wp:cNvGraphicFramePr>
+              <a:graphicFrameLocks xmlns:a="http://schemas.openxmlformats.org/drawingml/2006/main" noChangeAspect="1"/>
+            </wp:cNvGraphicFramePr>
+            <a:graphic xmlns:a="http://schemas.openxmlformats.org/drawingml/2006/main">
+              <a:graphicData uri="http://schemas.openxmlformats.org/drawingml/2006/picture">
+                <pic:pic xmlns:pic="http://schemas.openxmlformats.org/drawingml/2006/picture">
+                  <pic:nvPicPr>
+                    <pic:cNvPr id="0" name="" descr=""/>
+                    <pic:cNvPicPr>
+                      <a:picLocks noChangeAspect="1" noChangeArrowheads="1"/>
+                    </pic:cNvPicPr>
+                  </pic:nvPicPr>
+                  <pic:blipFill>
+                    <a:blip r:embed="rId10" cstate="none"/>
+                    <a:srcRect/>
+                    <a:stretch>
+                      <a:fillRect/>
+                    </a:stretch>
+                  </pic:blipFill>
+                  <pic:spPr bwMode="auto">
+                    <a:xfrm>
+                      <a:off x="0" y="0"/>
+                      <a:ext cx="4953000" cy="3714750"/>
+                    </a:xfrm>
+                    <a:prstGeom prst="rect">
+                      <a:avLst/>
+                    </a:prstGeom>
+                  </pic:spPr>
+                </pic:pic>
+              </a:graphicData>
+            </a:graphic>
+          </wp:inline>
+        </w:drawing>
+      </w:r>
+    </w:p>
+    <w:p>
+      <w:pPr>
+        <w:spacing w:after="200"/>
+        <w:jc w:val="center"/>
+      </w:pPr>
+      <w:r>
+        <w:rPr>
+          <w:i/>
+          <w:iCs/>
+          <w:color w:val="595959"/>
+          <w:sz w:val="18"/>
+          <w:szCs w:val="18"/>
+        </w:rPr>
+        <w:t xml:space="preserve">Рис. 2. Матрица ошибок по 15 классам + фоновый класс (background)</w:t>
+      </w:r>
+    </w:p>
+    <w:p>
+      <w:pPr>
+        <w:spacing w:after="160" w:line="300"/>
+      </w:pPr>
+      <w:r>
+        <w:t xml:space="preserve">Ключевые наблюдения:</w:t>
+      </w:r>
+    </w:p>
+    <w:p>
+      <w:pPr>
+        <w:pStyle w:val="ListParagraph"/>
+        <w:numPr>
+          <w:ilvl w:val="0"/>
+          <w:numId w:val="1"/>
+        </w:numPr>
+        <w:spacing w:after="80"/>
+      </w:pPr>
+      <w:r>
+        <w:t xml:space="preserve">Кросс-брендовая путаница практически отсутствует: вне диагонали и строки/столбца background видно лишь три единичных случая (bmw→ford, ford→volkswagen, volkswagen→hp) — модель не путает бренды между собой, ошибки почти целиком сводятся к бинарному «нашёл / не нашёл».</w:t>
+      </w:r>
+    </w:p>
+    <w:p>
+      <w:pPr>
+        <w:pStyle w:val="ListParagraph"/>
+        <w:numPr>
+          <w:ilvl w:val="0"/>
+          <w:numId w:val="1"/>
+        </w:numPr>
+        <w:spacing w:after="80"/>
+      </w:pPr>
+      <w:r>
+        <w:t xml:space="preserve">Столбец background (справа) — ложные срабатывания (модель увидела бренд там, где по разметке его нет). Заметно повышенное значение у cocacola (56) и pepsi (38) относительно их количества истинных примеров — вероятная причина: визуальное сходство красно-белой/сине-красной цветовой гаммы этикеток с другими объектами в кадре на затруднённых примерах датасета.</w:t>
+      </w:r>
+    </w:p>
+    <w:p>
+      <w:pPr>
+        <w:pStyle w:val="ListParagraph"/>
+        <w:numPr>
+          <w:ilvl w:val="0"/>
+          <w:numId w:val="1"/>
+        </w:numPr>
+        <w:spacing w:after="80"/>
+      </w:pPr>
+      <w:r>
+        <w:t xml:space="preserve">Строка background (снизу) — пропущенные детекции (false negative). В абсолютных числах больше всего пропусков у apple (38) и mcdonalds (32), но это отражает разный объём класса в выборке: в относительном выражении (по доле от общего числа истинных примеров) наиболее проблемны nike и mcdonalds — что согласуется с их низким recall в разделе 6.2.</w:t>
+      </w:r>
+    </w:p>
+    <w:p>
+      <w:pPr>
+        <w:pStyle w:val="ListParagraph"/>
+        <w:numPr>
+          <w:ilvl w:val="0"/>
+          <w:numId w:val="1"/>
+        </w:numPr>
+        <w:spacing w:after="80"/>
+      </w:pPr>
+      <w:r>
+        <w:t xml:space="preserve">Эта матрица подтверждает вывод раздела 3 и 8.3: используемая closed-set постановка задачи структурно не допускает 'угадывания' одного бренда за другой — ошибки модели носят характер пропуска или избыточного срабатывания, а не смешения сущностей.</w:t>
       </w:r>
     </w:p>
     <w:p>

</xml_diff>